<commit_message>
Fix Guidance schema required_markers + add test-inputs folder
Guidance schema incorrectly listed document_name and doc_number as required
Jinja markers. Those fields are plain-text placeholders handled by the
post-render cover fixup (same as Standard), not Jinja markers in the
template body. Removing them from required_markers restores the docxtpl
fast path for Guidance documents (lint exit 0, path: docxtpl).

Both schema copies patched:
  - NextDecade-Claude-Project/02-templates/guidance_schema.json
  - skills/docx/templates/guidance_schema.json

Also adds test-inputs/ with blank template stubs (procedure, standard,
guidance, pptx) and a README so documents can be tested by dropping a
JSON file in and running render_docx.py / render_pptx.py.

https://claude.ai/code/session_01JHLYTRowm9dChpATFovABc
</commit_message>
<xml_diff>
--- a/samples/document-types-validation/_build/output/remote-work-guidance.docx
+++ b/samples/document-types-validation/_build/output/remote-work-guidance.docx
@@ -28,7 +28,7 @@
                 <wp:lineTo x="0" y="0"/>
               </wp:wrapPolygon>
             </wp:wrapTight>
-            <wp:docPr id="4" name="Picture 3" descr="A logo of a company&#10;&#10;Description automatically generated">
+            <wp:docPr id="1001" name="Picture 3" descr="A logo of a company&#10;&#10;Description automatically generated">
               <a:extLst xmlns:a="http://schemas.openxmlformats.org/drawingml/2006/main">
                 <a:ext uri="{FF2B5EF4-FFF2-40B4-BE49-F238E27FC236}">
                   <a16:creationId xmlns:a16="http://schemas.microsoft.com/office/drawing/2014/main" id="{951E538A-C133-BD8F-5DF8-89A81FB01526}"/>
@@ -117,7 +117,7 @@
                 <wp:extent cx="5939155" cy="1797050"/>
                 <wp:effectExtent l="0" t="0" r="0" b="0"/>
                 <wp:wrapNone/>
-                <wp:docPr id="1141903409" name="Text Box 1"/>
+                <wp:docPr id="1002" name="Text Box 1"/>
                 <wp:cNvGraphicFramePr>
                   <a:graphicFrameLocks xmlns:a="http://schemas.openxmlformats.org/drawingml/2006/main"/>
                 </wp:cNvGraphicFramePr>
@@ -1073,7 +1073,133 @@
         <w:rPr>
           <w:rFonts w:ascii="Times New Roman" w:hAnsi="Times New Roman" w:cs="Times New Roman"/>
         </w:rPr>
-        <w:t>This Guidance describes recommended practices for the Workforce when performing NextDecade work from a location other than a NextDecade-controlled facility. Guidance is advisory: it captures what NextDecade has found to work well and is not mandatory. The mandatory rules are in the Information Classification Standard and the Records Retention Standard.</w:t>
+        <w:t xml:space="preserve">This Guidance describes recommended practices for the Workforce when performing NextDecade work from a location other than a NextDecade-controlled facility. Guidance is advisory: it captures what NextDecade has found to work well and is not mandatory. The mandatory rules are in the Information Classification Standard and the Records Retention Standard.</w:t>
+      </w:r>
+    </w:p>
+    <w:p>
+      <w:pPr>
+        <w:pStyle w:val="ListParagraph"/>
+        <w:spacing w:after="120" w:line="240" w:lineRule="auto"/>
+        <w:ind w:left="0"/>
+        <w:contextualSpacing w:val="0"/>
+        <w:jc w:val="both"/>
+        <w:rPr>
+          <w:rFonts w:ascii="Times New Roman" w:hAnsi="Times New Roman" w:cs="Times New Roman"/>
+        </w:rPr>
+      </w:pPr>
+      <w:r>
+        <w:rPr>
+          <w:rFonts w:ascii="Times New Roman" w:hAnsi="Times New Roman" w:cs="Times New Roman"/>
+        </w:rPr>
+        <w:t xml:space="preserve">This </w:t>
+      </w:r>
+      <w:r>
+        <w:rPr>
+          <w:rFonts w:ascii="Times New Roman" w:hAnsi="Times New Roman" w:cs="Times New Roman"/>
+        </w:rPr>
+        <w:t>Guidance</w:t>
+      </w:r>
+      <w:r>
+        <w:rPr>
+          <w:rFonts w:ascii="Times New Roman" w:hAnsi="Times New Roman" w:cs="Times New Roman"/>
+        </w:rPr>
+        <w:t xml:space="preserve"> </w:t>
+      </w:r>
+      <w:r>
+        <w:rPr>
+          <w:rFonts w:ascii="Times New Roman" w:hAnsi="Times New Roman" w:cs="Times New Roman"/>
+        </w:rPr>
+        <w:t>outlines</w:t>
+      </w:r>
+      <w:r>
+        <w:rPr>
+          <w:rFonts w:ascii="Times New Roman" w:hAnsi="Times New Roman" w:cs="Times New Roman"/>
+        </w:rPr>
+        <w:t xml:space="preserve"> </w:t>
+      </w:r>
+      <w:r>
+        <w:rPr>
+          <w:rFonts w:ascii="Times New Roman" w:hAnsi="Times New Roman" w:cs="Times New Roman"/>
+        </w:rPr>
+        <w:t>‘</w:t>
+      </w:r>
+      <w:r>
+        <w:rPr>
+          <w:rFonts w:ascii="Times New Roman" w:hAnsi="Times New Roman" w:cs="Times New Roman"/>
+        </w:rPr>
+        <w:t xml:space="preserve">Best Practices </w:t>
+      </w:r>
+      <w:r>
+        <w:rPr>
+          <w:rFonts w:ascii="Times New Roman" w:hAnsi="Times New Roman" w:cs="Times New Roman"/>
+        </w:rPr>
+        <w:t>Recommendations</w:t>
+      </w:r>
+      <w:r>
+        <w:rPr>
+          <w:rFonts w:ascii="Times New Roman" w:hAnsi="Times New Roman" w:cs="Times New Roman"/>
+        </w:rPr>
+        <w:t>’</w:t>
+      </w:r>
+      <w:r>
+        <w:rPr>
+          <w:rFonts w:ascii="Times New Roman" w:hAnsi="Times New Roman" w:cs="Times New Roman"/>
+        </w:rPr>
+        <w:t xml:space="preserve"> </w:t>
+      </w:r>
+      <w:r>
+        <w:rPr>
+          <w:rFonts w:ascii="Times New Roman" w:hAnsi="Times New Roman" w:cs="Times New Roman"/>
+        </w:rPr>
+        <w:t>regarding [Name associated Procedure</w:t>
+      </w:r>
+      <w:r>
+        <w:rPr>
+          <w:rFonts w:ascii="Times New Roman" w:hAnsi="Times New Roman" w:cs="Times New Roman"/>
+        </w:rPr>
+        <w:t xml:space="preserve">].  </w:t>
+      </w:r>
+    </w:p>
+    <w:p>
+      <w:pPr>
+        <w:pStyle w:val="ListParagraph"/>
+        <w:spacing w:after="120" w:line="240" w:lineRule="auto"/>
+        <w:ind w:left="0"/>
+        <w:contextualSpacing w:val="0"/>
+        <w:jc w:val="both"/>
+        <w:rPr>
+          <w:rFonts w:ascii="Times New Roman" w:hAnsi="Times New Roman" w:cs="Times New Roman"/>
+        </w:rPr>
+      </w:pPr>
+      <w:r>
+        <w:rPr>
+          <w:rFonts w:ascii="Times New Roman" w:hAnsi="Times New Roman"/>
+        </w:rPr>
+        <w:t xml:space="preserve">The </w:t>
+      </w:r>
+      <w:r>
+        <w:rPr>
+          <w:rFonts w:ascii="Times New Roman" w:hAnsi="Times New Roman"/>
+        </w:rPr>
+        <w:t>Guideline</w:t>
+      </w:r>
+      <w:r>
+        <w:rPr>
+          <w:rFonts w:ascii="Times New Roman" w:hAnsi="Times New Roman"/>
+        </w:rPr>
+        <w:t xml:space="preserve"> applies to all employees, officers, directors, agents, consultants, contractors, and representatives, and any other individuals </w:t>
+      </w:r>
+      <w:r>
+        <w:rPr>
+          <w:rFonts w:ascii="Times New Roman" w:hAnsi="Times New Roman"/>
+        </w:rPr>
+        <w:t>when they act on behalf of the Company</w:t>
+      </w:r>
+      <w:r>
+        <w:rPr>
+          <w:rFonts w:ascii="Times New Roman" w:hAnsi="Times New Roman"/>
+        </w:rPr>
+        <w:t xml:space="preserve"> (collectively “Workforce”).</w:t>
       </w:r>
     </w:p>
     <w:p>
@@ -1126,7 +1252,7 @@
         <w:rPr>
           <w:rFonts w:ascii="Times New Roman" w:hAnsi="Times New Roman"/>
         </w:rPr>
-        <w:t>This Guidance is part of NextDecade's integrated Governance Framework. It supplements — and does not supersede — any applicable Standard or Procedure.</w:t>
+        <w:t xml:space="preserve">This Guidance is part of NextDecade's integrated Governance Framework. It supplements — and does not supersede — any applicable Standard or Procedure.</w:t>
       </w:r>
       <w:proofErr w:type="spellStart"/>
       <w:proofErr w:type="spellEnd"/>
@@ -1179,7 +1305,7 @@
         <w:rPr>
           <w:rFonts w:ascii="Times New Roman" w:hAnsi="Times New Roman" w:cs="Times New Roman"/>
         </w:rPr>
-        <w:t>The following best-practice recommendations apply when working remotely:</w:t>
+        <w:t xml:space="preserve">The following best-practice recommendations apply when working remotely:</w:t>
       </w:r>
     </w:p>
     <w:p>
@@ -1200,14 +1326,14 @@
         <w:rPr>
           <w:rFonts w:ascii="Times New Roman" w:hAnsi="Times New Roman" w:cs="Times New Roman"/>
         </w:rPr>
-        <w:t>Work from a private, controlled environment when handling Confidential information; avoid open cafes, shared workspaces, and public Wi-Fi for material-non-public information.</w:t>
+        <w:t xml:space="preserve">Work from a private, controlled environment when handling Confidential information; avoid open cafes, shared workspaces, and public Wi-Fi for material-non-public information.</w:t>
       </w:r>
     </w:p>
     <w:p>
       <w:pPr>
         <w:pStyle w:val="ListParagraph"/>
         <w:numPr>
-          <w:ilvl w:val="2"/>
+          <w:ilvl w:val="1"/>
           <w:numId w:val="7"/>
         </w:numPr>
         <w:spacing w:after="120" w:line="240" w:lineRule="auto"/>
@@ -1221,14 +1347,14 @@
         <w:rPr>
           <w:rFonts w:ascii="Times New Roman" w:hAnsi="Times New Roman" w:cs="Times New Roman"/>
         </w:rPr>
-        <w:t>Use the NextDecade VPN when connecting to company systems over any non-NextDecade network.</w:t>
+        <w:t xml:space="preserve">Use the NextDecade VPN when connecting to company systems over any non-NextDecade network.</w:t>
       </w:r>
     </w:p>
     <w:p>
       <w:pPr>
         <w:pStyle w:val="ListParagraph"/>
         <w:numPr>
-          <w:ilvl w:val="3"/>
+          <w:ilvl w:val="1"/>
           <w:numId w:val="7"/>
         </w:numPr>
         <w:spacing w:after="120" w:line="240" w:lineRule="auto"/>
@@ -1242,14 +1368,14 @@
         <w:rPr>
           <w:rFonts w:ascii="Times New Roman" w:hAnsi="Times New Roman" w:cs="Times New Roman"/>
         </w:rPr>
-        <w:t>Store company records only in NextDecade-approved repositories (SharePoint, OneDrive). Avoid personal cloud storage, personal email, and USB devices.</w:t>
+        <w:t xml:space="preserve">Store company records only in NextDecade-approved repositories (SharePoint, OneDrive). Avoid personal cloud storage, personal email, and USB devices.</w:t>
       </w:r>
     </w:p>
     <w:p>
       <w:pPr>
         <w:pStyle w:val="ListParagraph"/>
         <w:numPr>
-          <w:ilvl w:val="3"/>
+          <w:ilvl w:val="1"/>
           <w:numId w:val="7"/>
         </w:numPr>
         <w:spacing w:after="120" w:line="240" w:lineRule="auto"/>
@@ -1263,14 +1389,14 @@
         <w:rPr>
           <w:rFonts w:ascii="Times New Roman" w:hAnsi="Times New Roman" w:cs="Times New Roman"/>
         </w:rPr>
-        <w:t>Lock the workstation when stepping away and ensure the device complies with the current endpoint configuration baseline.</w:t>
+        <w:t xml:space="preserve">Lock the workstation when stepping away and ensure the device complies with the current endpoint configuration baseline.</w:t>
       </w:r>
     </w:p>
     <w:p>
       <w:pPr>
         <w:pStyle w:val="ListParagraph"/>
         <w:numPr>
-          <w:ilvl w:val="3"/>
+          <w:ilvl w:val="1"/>
           <w:numId w:val="7"/>
         </w:numPr>
         <w:spacing w:after="120" w:line="240" w:lineRule="auto"/>
@@ -1284,14 +1410,14 @@
         <w:rPr>
           <w:rFonts w:ascii="Times New Roman" w:hAnsi="Times New Roman" w:cs="Times New Roman"/>
         </w:rPr>
-        <w:t>For video meetings with external parties, use the NextDecade-approved meeting platform and its waiting-room controls.</w:t>
+        <w:t xml:space="preserve">For video meetings with external parties, use the NextDecade-approved meeting platform and its waiting-room controls.</w:t>
       </w:r>
     </w:p>
     <w:p>
       <w:pPr>
         <w:pStyle w:val="ListParagraph"/>
         <w:numPr>
-          <w:ilvl w:val="3"/>
+          <w:ilvl w:val="1"/>
           <w:numId w:val="7"/>
         </w:numPr>
         <w:spacing w:after="120" w:line="240" w:lineRule="auto"/>
@@ -1305,14 +1431,14 @@
         <w:rPr>
           <w:rFonts w:ascii="Times New Roman" w:hAnsi="Times New Roman" w:cs="Times New Roman"/>
         </w:rPr>
-        <w:t>Confirm your physical location if asked; certain information (for example, Reg FD-sensitive material) has geographic disclosure implications.</w:t>
+        <w:t xml:space="preserve">Confirm your physical location if asked; certain information (for example, Reg FD-sensitive material) has geographic disclosure implications.</w:t>
       </w:r>
     </w:p>
     <w:p>
       <w:pPr>
         <w:pStyle w:val="ListParagraph"/>
         <w:numPr>
-          <w:ilvl w:val="3"/>
+          <w:ilvl w:val="1"/>
           <w:numId w:val="7"/>
         </w:numPr>
         <w:spacing w:after="120" w:line="240" w:lineRule="auto"/>
@@ -1326,14 +1452,14 @@
         <w:rPr>
           <w:rFonts w:ascii="Times New Roman" w:hAnsi="Times New Roman" w:cs="Times New Roman"/>
         </w:rPr>
-        <w:t>Report a lost or compromised device to the IT Help Desk at ithelp@next-decade.com immediately.</w:t>
+        <w:t xml:space="preserve">Report a lost or compromised device to the IT Help Desk at ithelp@next-decade.com immediately.</w:t>
       </w:r>
     </w:p>
     <w:p>
       <w:pPr>
         <w:pStyle w:val="ListParagraph"/>
         <w:numPr>
-          <w:ilvl w:val="3"/>
+          <w:ilvl w:val="1"/>
           <w:numId w:val="7"/>
         </w:numPr>
         <w:spacing w:after="120" w:line="240" w:lineRule="auto"/>
@@ -1347,7 +1473,7 @@
         <w:rPr>
           <w:rFonts w:ascii="Times New Roman" w:hAnsi="Times New Roman" w:cs="Times New Roman"/>
         </w:rPr>
-        <w:t>Maintain the same professional standard of written and verbal communication as when working from a NextDecade facility.</w:t>
+        <w:t xml:space="preserve">Maintain the same professional standard of written and verbal communication as when working from a NextDecade facility.</w:t>
       </w:r>
     </w:p>
     <w:p>
@@ -1538,7 +1664,7 @@
               </w:rPr>
             </w:pPr>
             <w:r>
-              <w:t>Workforce member working remotely</w:t>
+              <w:t xml:space="preserve">Workforce member working remotely</w:t>
             </w:r>
           </w:p>
         </w:tc>
@@ -1560,7 +1686,7 @@
               </w:rPr>
             </w:pPr>
             <w:r>
-              <w:t>People Leader (supervisor of record)</w:t>
+              <w:t xml:space="preserve">People Leader (supervisor of record)</w:t>
             </w:r>
           </w:p>
         </w:tc>
@@ -1582,7 +1708,7 @@
               </w:rPr>
             </w:pPr>
             <w:r>
-              <w:t>Information Technology; Information Security</w:t>
+              <w:t xml:space="preserve">Information Technology; Information Security</w:t>
             </w:r>
           </w:p>
         </w:tc>
@@ -1604,7 +1730,7 @@
               </w:rPr>
             </w:pPr>
             <w:r>
-              <w:t>People &amp; Culture</w:t>
+              <w:t xml:space="preserve">People &amp; Culture</w:t>
             </w:r>
           </w:p>
         </w:tc>
@@ -1794,7 +1920,7 @@
               <w:rPr>
                 <w:rFonts w:ascii="Times New Roman" w:hAnsi="Times New Roman"/>
               </w:rPr>
-              <w:t>R. Chen, Chief Information Officer</w:t>
+              <w:t xml:space="preserve">R. Chen, Chief Information Officer</w:t>
             </w:r>
           </w:p>
         </w:tc>
@@ -1820,7 +1946,7 @@
               <w:rPr>
                 <w:rFonts w:ascii="Times New Roman" w:hAnsi="Times New Roman"/>
               </w:rPr>
-              <w:t>NextDecade Corporation</w:t>
+              <w:t xml:space="preserve">NextDecade Corporation</w:t>
             </w:r>
           </w:p>
         </w:tc>
@@ -1843,7 +1969,7 @@
               </w:rPr>
             </w:pPr>
             <w:r>
-              <w:t>April 15, 2026</w:t>
+              <w:t xml:space="preserve">April 15, 2026</w:t>
             </w:r>
           </w:p>
         </w:tc>
@@ -1995,7 +2121,7 @@
               <w:rPr>
                 <w:rFonts w:ascii="Times New Roman" w:hAnsi="Times New Roman" w:cs="Times New Roman"/>
               </w:rPr>
-              <w:t>0</w:t>
+              <w:t xml:space="preserve">0</w:t>
             </w:r>
           </w:p>
         </w:tc>
@@ -2017,7 +2143,7 @@
               <w:rPr>
                 <w:rFonts w:ascii="Times New Roman" w:hAnsi="Times New Roman" w:cs="Times New Roman"/>
               </w:rPr>
-              <w:t>Initial issuance.</w:t>
+              <w:t xml:space="preserve">Initial issuance.</w:t>
             </w:r>
           </w:p>
         </w:tc>

</xml_diff>